<commit_message>
added final project report
</commit_message>
<xml_diff>
--- a/final_project/final_presentation/Wycliff_Kaweesa_final_report.docx
+++ b/final_project/final_presentation/Wycliff_Kaweesa_final_report.docx
@@ -2,6 +2,798 @@
 <file path=word/document.xml><?xml version="1.0" encoding="utf-8"?>
 <w:document xmlns:wpc="http://schemas.microsoft.com/office/word/2010/wordprocessingCanvas" xmlns:cx="http://schemas.microsoft.com/office/drawing/2014/chartex" xmlns:cx1="http://schemas.microsoft.com/office/drawing/2015/9/8/chartex" xmlns:cx2="http://schemas.microsoft.com/office/drawing/2015/10/21/chartex" xmlns:cx3="http://schemas.microsoft.com/office/drawing/2016/5/9/chartex" xmlns:cx4="http://schemas.microsoft.com/office/drawing/2016/5/10/chartex" xmlns:cx5="http://schemas.microsoft.com/office/drawing/2016/5/11/chartex" xmlns:cx6="http://schemas.microsoft.com/office/drawing/2016/5/12/chartex" xmlns:cx7="http://schemas.microsoft.com/office/drawing/2016/5/13/chartex" xmlns:cx8="http://schemas.microsoft.com/office/drawing/2016/5/14/chartex" xmlns:mc="http://schemas.openxmlformats.org/markup-compatibility/2006" xmlns:aink="http://schemas.microsoft.com/office/drawing/2016/ink" xmlns:am3d="http://schemas.microsoft.com/office/drawing/2017/model3d" xmlns:o="urn:schemas-microsoft-com:office:office" xmlns:oel="http://schemas.microsoft.com/office/2019/extlst" xmlns:r="http://schemas.openxmlformats.org/officeDocument/2006/relationships" xmlns:m="http://schemas.openxmlformats.org/officeDocument/2006/math" xmlns:v="urn:schemas-microsoft-com:vml" xmlns:wp14="http://schemas.microsoft.com/office/word/2010/wordprocessingDrawing" xmlns:wp="http://schemas.openxmlformats.org/drawingml/2006/wordprocessingDrawing" xmlns:w10="urn:schemas-microsoft-com:office:word" xmlns:w="http://schemas.openxmlformats.org/wordprocessingml/2006/main" xmlns:w14="http://schemas.microsoft.com/office/word/2010/wordml" xmlns:w15="http://schemas.microsoft.com/office/word/2012/wordml" xmlns:w16cex="http://schemas.microsoft.com/office/word/2018/wordml/cex" xmlns:w16cid="http://schemas.microsoft.com/office/word/2016/wordml/cid" xmlns:w16="http://schemas.microsoft.com/office/word/2018/wordml" xmlns:w16du="http://schemas.microsoft.com/office/word/2023/wordml/word16du" xmlns:w16sdtdh="http://schemas.microsoft.com/office/word/2020/wordml/sdtdatahash" xmlns:w16sdtfl="http://schemas.microsoft.com/office/word/2024/wordml/sdtformatlock" xmlns:w16se="http://schemas.microsoft.com/office/word/2015/wordml/symex" xmlns:wpg="http://schemas.microsoft.com/office/word/2010/wordprocessingGroup" xmlns:wpi="http://schemas.microsoft.com/office/word/2010/wordprocessingInk" xmlns:wne="http://schemas.microsoft.com/office/word/2006/wordml" xmlns:wps="http://schemas.microsoft.com/office/word/2010/wordprocessingShape" mc:Ignorable="w14 w15 w16se w16cid w16 w16cex w16sdtdh w16sdtfl w16du wp14">
   <w:body>
+    <w:p>
+      <w:pPr>
+        <w:rPr>
+          <w:lang w:val="de-DE"/>
+        </w:rPr>
+      </w:pPr>
+    </w:p>
+    <w:p>
+      <w:pPr>
+        <w:rPr>
+          <w:lang w:val="de-DE"/>
+        </w:rPr>
+      </w:pPr>
+    </w:p>
+    <w:p>
+      <w:pPr>
+        <w:rPr>
+          <w:lang w:val="de-DE"/>
+        </w:rPr>
+      </w:pPr>
+    </w:p>
+    <w:p>
+      <w:pPr>
+        <w:rPr>
+          <w:lang w:val="de-DE"/>
+        </w:rPr>
+      </w:pPr>
+    </w:p>
+    <w:p>
+      <w:pPr>
+        <w:rPr>
+          <w:lang w:val="de-DE"/>
+        </w:rPr>
+      </w:pPr>
+    </w:p>
+    <w:p>
+      <w:pPr>
+        <w:rPr>
+          <w:lang w:val="de-DE"/>
+        </w:rPr>
+      </w:pPr>
+    </w:p>
+    <w:p>
+      <w:pPr>
+        <w:rPr>
+          <w:lang w:val="de-DE"/>
+        </w:rPr>
+      </w:pPr>
+    </w:p>
+    <w:p>
+      <w:pPr>
+        <w:rPr>
+          <w:lang w:val="de-DE"/>
+        </w:rPr>
+      </w:pPr>
+    </w:p>
+    <w:p>
+      <w:pPr>
+        <w:rPr>
+          <w:lang w:val="de-DE"/>
+        </w:rPr>
+      </w:pPr>
+    </w:p>
+    <w:p>
+      <w:pPr>
+        <w:rPr>
+          <w:lang w:val="de-DE"/>
+        </w:rPr>
+      </w:pPr>
+    </w:p>
+    <w:p>
+      <w:pPr>
+        <w:rPr>
+          <w:lang w:val="de-DE"/>
+        </w:rPr>
+      </w:pPr>
+    </w:p>
+    <w:p>
+      <w:pPr>
+        <w:rPr>
+          <w:lang w:val="de-DE"/>
+        </w:rPr>
+      </w:pPr>
+    </w:p>
+    <w:p>
+      <w:pPr>
+        <w:rPr>
+          <w:lang w:val="de-DE"/>
+        </w:rPr>
+      </w:pPr>
+    </w:p>
+    <w:p>
+      <w:pPr>
+        <w:rPr>
+          <w:lang w:val="de-DE"/>
+        </w:rPr>
+      </w:pPr>
+    </w:p>
+    <w:p>
+      <w:pPr>
+        <w:rPr>
+          <w:lang w:val="de-DE"/>
+        </w:rPr>
+      </w:pPr>
+    </w:p>
+    <w:p>
+      <w:pPr>
+        <w:rPr>
+          <w:lang w:val="de-DE"/>
+        </w:rPr>
+      </w:pPr>
+    </w:p>
+    <w:p>
+      <w:pPr>
+        <w:rPr>
+          <w:lang w:val="de-DE"/>
+        </w:rPr>
+      </w:pPr>
+    </w:p>
+    <w:p>
+      <w:pPr>
+        <w:rPr>
+          <w:lang w:val="de-DE"/>
+        </w:rPr>
+      </w:pPr>
+    </w:p>
+    <w:p>
+      <w:pPr>
+        <w:rPr>
+          <w:lang w:val="de-DE"/>
+        </w:rPr>
+      </w:pPr>
+    </w:p>
+    <w:p>
+      <w:pPr>
+        <w:rPr>
+          <w:lang w:val="de-DE"/>
+        </w:rPr>
+      </w:pPr>
+    </w:p>
+    <w:p>
+      <w:pPr>
+        <w:rPr>
+          <w:lang w:val="de-DE"/>
+        </w:rPr>
+      </w:pPr>
+    </w:p>
+    <w:p>
+      <w:pPr>
+        <w:rPr>
+          <w:lang w:val="de-DE"/>
+        </w:rPr>
+      </w:pPr>
+    </w:p>
+    <w:p>
+      <w:pPr>
+        <w:rPr>
+          <w:lang w:val="de-DE"/>
+        </w:rPr>
+      </w:pPr>
+    </w:p>
+    <w:p>
+      <w:pPr>
+        <w:rPr>
+          <w:lang w:val="de-DE"/>
+        </w:rPr>
+      </w:pPr>
+    </w:p>
+    <w:p>
+      <w:pPr>
+        <w:rPr>
+          <w:lang w:val="de-DE"/>
+        </w:rPr>
+      </w:pPr>
+    </w:p>
+    <w:p>
+      <w:pPr>
+        <w:rPr>
+          <w:lang w:val="de-DE"/>
+        </w:rPr>
+      </w:pPr>
+    </w:p>
+    <w:p>
+      <w:pPr>
+        <w:rPr>
+          <w:lang w:val="de-DE"/>
+        </w:rPr>
+      </w:pPr>
+    </w:p>
+    <w:p>
+      <w:pPr>
+        <w:rPr>
+          <w:lang w:val="de-DE"/>
+        </w:rPr>
+      </w:pPr>
+    </w:p>
+    <w:p>
+      <w:pPr>
+        <w:rPr>
+          <w:lang w:val="de-DE"/>
+        </w:rPr>
+      </w:pPr>
+    </w:p>
+    <w:sdt>
+      <w:sdtPr>
+        <w:id w:val="-328524075"/>
+        <w:docPartObj>
+          <w:docPartGallery w:val="Table of Contents"/>
+          <w:docPartUnique/>
+        </w:docPartObj>
+      </w:sdtPr>
+      <w:sdtEndPr>
+        <w:rPr>
+          <w:rFonts w:asciiTheme="minorHAnsi" w:eastAsiaTheme="minorHAnsi" w:hAnsiTheme="minorHAnsi" w:cstheme="minorBidi"/>
+          <w:b/>
+          <w:bCs/>
+          <w:sz w:val="22"/>
+          <w:szCs w:val="22"/>
+          <w:lang w:eastAsia="en-US"/>
+          <w14:ligatures w14:val="standardContextual"/>
+        </w:rPr>
+      </w:sdtEndPr>
+      <w:sdtContent>
+        <w:p>
+          <w:pPr>
+            <w:pStyle w:val="TOCHeading"/>
+          </w:pPr>
+          <w:r>
+            <w:t>Contents</w:t>
+          </w:r>
+        </w:p>
+        <w:p>
+          <w:pPr>
+            <w:pStyle w:val="TOC1"/>
+            <w:tabs>
+              <w:tab w:val="right" w:leader="dot" w:pos="9350"/>
+            </w:tabs>
+            <w:rPr>
+              <w:rFonts w:eastAsiaTheme="minorEastAsia"/>
+              <w:noProof/>
+              <w:kern w:val="2"/>
+              <w:sz w:val="24"/>
+              <w:szCs w:val="24"/>
+              <w:lang w:eastAsia="en-GB"/>
+            </w:rPr>
+          </w:pPr>
+          <w:r>
+            <w:fldChar w:fldCharType="begin"/>
+          </w:r>
+          <w:r>
+            <w:instrText xml:space="preserve"> TOC \o "1-3" \h \z \u </w:instrText>
+          </w:r>
+          <w:r>
+            <w:fldChar w:fldCharType="separate"/>
+          </w:r>
+          <w:hyperlink w:anchor="_Toc243854531" w:history="1">
+            <w:r>
+              <w:rPr>
+                <w:rStyle w:val="Hyperlink"/>
+                <w:noProof/>
+              </w:rPr>
+              <w:t>List of figures</w:t>
+            </w:r>
+            <w:r>
+              <w:rPr>
+                <w:noProof/>
+                <w:webHidden/>
+              </w:rPr>
+              <w:tab/>
+            </w:r>
+            <w:r>
+              <w:rPr>
+                <w:noProof/>
+                <w:webHidden/>
+              </w:rPr>
+              <w:fldChar w:fldCharType="begin"/>
+            </w:r>
+            <w:r>
+              <w:rPr>
+                <w:noProof/>
+                <w:webHidden/>
+              </w:rPr>
+              <w:instrText xml:space="preserve"> PAGEREF _Toc243854531 \h </w:instrText>
+            </w:r>
+            <w:r>
+              <w:rPr>
+                <w:noProof/>
+                <w:webHidden/>
+              </w:rPr>
+            </w:r>
+            <w:r>
+              <w:rPr>
+                <w:noProof/>
+                <w:webHidden/>
+              </w:rPr>
+              <w:fldChar w:fldCharType="separate"/>
+            </w:r>
+            <w:r>
+              <w:rPr>
+                <w:noProof/>
+                <w:webHidden/>
+              </w:rPr>
+              <w:t>3</w:t>
+            </w:r>
+            <w:r>
+              <w:rPr>
+                <w:noProof/>
+                <w:webHidden/>
+              </w:rPr>
+              <w:fldChar w:fldCharType="end"/>
+            </w:r>
+          </w:hyperlink>
+        </w:p>
+        <w:p>
+          <w:pPr>
+            <w:pStyle w:val="TOC1"/>
+            <w:tabs>
+              <w:tab w:val="right" w:leader="dot" w:pos="9350"/>
+            </w:tabs>
+            <w:rPr>
+              <w:rFonts w:eastAsiaTheme="minorEastAsia"/>
+              <w:noProof/>
+              <w:kern w:val="2"/>
+              <w:sz w:val="24"/>
+              <w:szCs w:val="24"/>
+              <w:lang w:eastAsia="en-GB"/>
+            </w:rPr>
+          </w:pPr>
+          <w:hyperlink w:anchor="_Toc243854532" w:history="1">
+            <w:r>
+              <w:rPr>
+                <w:rStyle w:val="Hyperlink"/>
+                <w:noProof/>
+              </w:rPr>
+              <w:t>List of tables</w:t>
+            </w:r>
+            <w:r>
+              <w:rPr>
+                <w:noProof/>
+                <w:webHidden/>
+              </w:rPr>
+              <w:tab/>
+            </w:r>
+            <w:r>
+              <w:rPr>
+                <w:noProof/>
+                <w:webHidden/>
+              </w:rPr>
+              <w:fldChar w:fldCharType="begin"/>
+            </w:r>
+            <w:r>
+              <w:rPr>
+                <w:noProof/>
+                <w:webHidden/>
+              </w:rPr>
+              <w:instrText xml:space="preserve"> PAGEREF _Toc243854532 \h </w:instrText>
+            </w:r>
+            <w:r>
+              <w:rPr>
+                <w:noProof/>
+                <w:webHidden/>
+              </w:rPr>
+            </w:r>
+            <w:r>
+              <w:rPr>
+                <w:noProof/>
+                <w:webHidden/>
+              </w:rPr>
+              <w:fldChar w:fldCharType="separate"/>
+            </w:r>
+            <w:r>
+              <w:rPr>
+                <w:noProof/>
+                <w:webHidden/>
+              </w:rPr>
+              <w:t>3</w:t>
+            </w:r>
+            <w:r>
+              <w:rPr>
+                <w:noProof/>
+                <w:webHidden/>
+              </w:rPr>
+              <w:fldChar w:fldCharType="end"/>
+            </w:r>
+          </w:hyperlink>
+        </w:p>
+        <w:p>
+          <w:pPr>
+            <w:pStyle w:val="TOC1"/>
+            <w:tabs>
+              <w:tab w:val="right" w:leader="dot" w:pos="9350"/>
+            </w:tabs>
+            <w:rPr>
+              <w:rFonts w:eastAsiaTheme="minorEastAsia"/>
+              <w:noProof/>
+              <w:kern w:val="2"/>
+              <w:sz w:val="24"/>
+              <w:szCs w:val="24"/>
+              <w:lang w:eastAsia="en-GB"/>
+            </w:rPr>
+          </w:pPr>
+          <w:hyperlink w:anchor="_Toc243854533" w:history="1">
+            <w:r>
+              <w:rPr>
+                <w:rStyle w:val="Hyperlink"/>
+                <w:noProof/>
+              </w:rPr>
+              <w:t>1 Abstract</w:t>
+            </w:r>
+            <w:r>
+              <w:rPr>
+                <w:noProof/>
+                <w:webHidden/>
+              </w:rPr>
+              <w:tab/>
+            </w:r>
+            <w:r>
+              <w:rPr>
+                <w:noProof/>
+                <w:webHidden/>
+              </w:rPr>
+              <w:fldChar w:fldCharType="begin"/>
+            </w:r>
+            <w:r>
+              <w:rPr>
+                <w:noProof/>
+                <w:webHidden/>
+              </w:rPr>
+              <w:instrText xml:space="preserve"> PAGEREF _Toc243854533 \h </w:instrText>
+            </w:r>
+            <w:r>
+              <w:rPr>
+                <w:noProof/>
+                <w:webHidden/>
+              </w:rPr>
+            </w:r>
+            <w:r>
+              <w:rPr>
+                <w:noProof/>
+                <w:webHidden/>
+              </w:rPr>
+              <w:fldChar w:fldCharType="separate"/>
+            </w:r>
+            <w:r>
+              <w:rPr>
+                <w:noProof/>
+                <w:webHidden/>
+              </w:rPr>
+              <w:t>3</w:t>
+            </w:r>
+            <w:r>
+              <w:rPr>
+                <w:noProof/>
+                <w:webHidden/>
+              </w:rPr>
+              <w:fldChar w:fldCharType="end"/>
+            </w:r>
+          </w:hyperlink>
+        </w:p>
+        <w:p>
+          <w:pPr>
+            <w:pStyle w:val="TOC1"/>
+            <w:tabs>
+              <w:tab w:val="right" w:leader="dot" w:pos="9350"/>
+            </w:tabs>
+            <w:rPr>
+              <w:rFonts w:eastAsiaTheme="minorEastAsia"/>
+              <w:noProof/>
+              <w:kern w:val="2"/>
+              <w:sz w:val="24"/>
+              <w:szCs w:val="24"/>
+              <w:lang w:eastAsia="en-GB"/>
+            </w:rPr>
+          </w:pPr>
+          <w:hyperlink w:anchor="_Toc243854534" w:history="1">
+            <w:r>
+              <w:rPr>
+                <w:rStyle w:val="Hyperlink"/>
+                <w:noProof/>
+              </w:rPr>
+              <w:t>2 Methodology</w:t>
+            </w:r>
+            <w:r>
+              <w:rPr>
+                <w:noProof/>
+                <w:webHidden/>
+              </w:rPr>
+              <w:tab/>
+            </w:r>
+            <w:r>
+              <w:rPr>
+                <w:noProof/>
+                <w:webHidden/>
+              </w:rPr>
+              <w:fldChar w:fldCharType="begin"/>
+            </w:r>
+            <w:r>
+              <w:rPr>
+                <w:noProof/>
+                <w:webHidden/>
+              </w:rPr>
+              <w:instrText xml:space="preserve"> PAGEREF _Toc243854534 \h </w:instrText>
+            </w:r>
+            <w:r>
+              <w:rPr>
+                <w:noProof/>
+                <w:webHidden/>
+              </w:rPr>
+            </w:r>
+            <w:r>
+              <w:rPr>
+                <w:noProof/>
+                <w:webHidden/>
+              </w:rPr>
+              <w:fldChar w:fldCharType="separate"/>
+            </w:r>
+            <w:r>
+              <w:rPr>
+                <w:noProof/>
+                <w:webHidden/>
+              </w:rPr>
+              <w:t>3</w:t>
+            </w:r>
+            <w:r>
+              <w:rPr>
+                <w:noProof/>
+                <w:webHidden/>
+              </w:rPr>
+              <w:fldChar w:fldCharType="end"/>
+            </w:r>
+          </w:hyperlink>
+        </w:p>
+        <w:p>
+          <w:pPr>
+            <w:pStyle w:val="TOC1"/>
+            <w:tabs>
+              <w:tab w:val="right" w:leader="dot" w:pos="9350"/>
+            </w:tabs>
+            <w:rPr>
+              <w:rFonts w:eastAsiaTheme="minorEastAsia"/>
+              <w:noProof/>
+              <w:kern w:val="2"/>
+              <w:sz w:val="24"/>
+              <w:szCs w:val="24"/>
+              <w:lang w:eastAsia="en-GB"/>
+            </w:rPr>
+          </w:pPr>
+          <w:hyperlink w:anchor="_Toc243854535" w:history="1">
+            <w:r>
+              <w:rPr>
+                <w:rStyle w:val="Hyperlink"/>
+                <w:noProof/>
+              </w:rPr>
+              <w:t>3 Results</w:t>
+            </w:r>
+            <w:r>
+              <w:rPr>
+                <w:noProof/>
+                <w:webHidden/>
+              </w:rPr>
+              <w:tab/>
+            </w:r>
+            <w:r>
+              <w:rPr>
+                <w:noProof/>
+                <w:webHidden/>
+              </w:rPr>
+              <w:fldChar w:fldCharType="begin"/>
+            </w:r>
+            <w:r>
+              <w:rPr>
+                <w:noProof/>
+                <w:webHidden/>
+              </w:rPr>
+              <w:instrText xml:space="preserve"> PAGEREF _Toc243854535 \h </w:instrText>
+            </w:r>
+            <w:r>
+              <w:rPr>
+                <w:noProof/>
+                <w:webHidden/>
+              </w:rPr>
+            </w:r>
+            <w:r>
+              <w:rPr>
+                <w:noProof/>
+                <w:webHidden/>
+              </w:rPr>
+              <w:fldChar w:fldCharType="separate"/>
+            </w:r>
+            <w:r>
+              <w:rPr>
+                <w:noProof/>
+                <w:webHidden/>
+              </w:rPr>
+              <w:t>3</w:t>
+            </w:r>
+            <w:r>
+              <w:rPr>
+                <w:noProof/>
+                <w:webHidden/>
+              </w:rPr>
+              <w:fldChar w:fldCharType="end"/>
+            </w:r>
+          </w:hyperlink>
+        </w:p>
+        <w:p>
+          <w:pPr>
+            <w:pStyle w:val="TOC1"/>
+            <w:tabs>
+              <w:tab w:val="right" w:leader="dot" w:pos="9350"/>
+            </w:tabs>
+            <w:rPr>
+              <w:rFonts w:eastAsiaTheme="minorEastAsia"/>
+              <w:noProof/>
+              <w:kern w:val="2"/>
+              <w:sz w:val="24"/>
+              <w:szCs w:val="24"/>
+              <w:lang w:eastAsia="en-GB"/>
+            </w:rPr>
+          </w:pPr>
+          <w:hyperlink w:anchor="_Toc243854536" w:history="1">
+            <w:r>
+              <w:rPr>
+                <w:rStyle w:val="Hyperlink"/>
+                <w:noProof/>
+              </w:rPr>
+              <w:t>4 Conclusion</w:t>
+            </w:r>
+            <w:r>
+              <w:rPr>
+                <w:noProof/>
+                <w:webHidden/>
+              </w:rPr>
+              <w:tab/>
+            </w:r>
+            <w:r>
+              <w:rPr>
+                <w:noProof/>
+                <w:webHidden/>
+              </w:rPr>
+              <w:fldChar w:fldCharType="begin"/>
+            </w:r>
+            <w:r>
+              <w:rPr>
+                <w:noProof/>
+                <w:webHidden/>
+              </w:rPr>
+              <w:instrText xml:space="preserve"> PAGEREF _Toc243854536 \h </w:instrText>
+            </w:r>
+            <w:r>
+              <w:rPr>
+                <w:noProof/>
+                <w:webHidden/>
+              </w:rPr>
+            </w:r>
+            <w:r>
+              <w:rPr>
+                <w:noProof/>
+                <w:webHidden/>
+              </w:rPr>
+              <w:fldChar w:fldCharType="separate"/>
+            </w:r>
+            <w:r>
+              <w:rPr>
+                <w:noProof/>
+                <w:webHidden/>
+              </w:rPr>
+              <w:t>3</w:t>
+            </w:r>
+            <w:r>
+              <w:rPr>
+                <w:noProof/>
+                <w:webHidden/>
+              </w:rPr>
+              <w:fldChar w:fldCharType="end"/>
+            </w:r>
+          </w:hyperlink>
+        </w:p>
+        <w:p>
+          <w:r>
+            <w:rPr>
+              <w:b/>
+              <w:bCs/>
+            </w:rPr>
+            <w:fldChar w:fldCharType="end"/>
+          </w:r>
+        </w:p>
+      </w:sdtContent>
+    </w:sdt>
+    <w:p/>
+    <w:p/>
+    <w:p/>
+    <w:p/>
+    <w:p/>
+    <w:p/>
+    <w:p/>
+    <w:p/>
+    <w:p/>
+    <w:p/>
+    <w:p/>
+    <w:p/>
+    <w:p/>
+    <w:p/>
+    <w:p/>
+    <w:p/>
+    <w:p/>
+    <w:p/>
+    <w:p/>
+    <w:p/>
+    <w:p/>
+    <w:p/>
+    <w:p/>
+    <w:p/>
+    <w:p/>
+    <w:p/>
+    <w:p/>
+    <w:p>
+      <w:pPr>
+        <w:pStyle w:val="Heading1"/>
+      </w:pPr>
+      <w:bookmarkStart w:id="0" w:name="_Toc243854531"/>
+      <w:r>
+        <w:t>List of figures</w:t>
+      </w:r>
+      <w:bookmarkEnd w:id="0"/>
+    </w:p>
+    <w:p>
+      <w:pPr>
+        <w:pStyle w:val="Heading1"/>
+      </w:pPr>
+      <w:bookmarkStart w:id="1" w:name="_Toc243854532"/>
+      <w:r>
+        <w:t>List of tables</w:t>
+      </w:r>
+      <w:bookmarkEnd w:id="1"/>
+    </w:p>
+    <w:p>
+      <w:pPr>
+        <w:pStyle w:val="Heading1"/>
+      </w:pPr>
+      <w:bookmarkStart w:id="2" w:name="_Toc243854533"/>
+      <w:r>
+        <w:t>1 Abstract</w:t>
+      </w:r>
+      <w:bookmarkEnd w:id="2"/>
+      <w:r>
+        <w:t xml:space="preserve"> </w:t>
+      </w:r>
+    </w:p>
+    <w:p/>
+    <w:p>
+      <w:pPr>
+        <w:pStyle w:val="Heading1"/>
+      </w:pPr>
+      <w:bookmarkStart w:id="3" w:name="_Toc243854534"/>
+      <w:r>
+        <w:t>2 Methodology</w:t>
+      </w:r>
+      <w:bookmarkEnd w:id="3"/>
+      <w:r>
+        <w:t xml:space="preserve"> </w:t>
+      </w:r>
+    </w:p>
+    <w:p/>
+    <w:p>
+      <w:pPr>
+        <w:pStyle w:val="Heading1"/>
+      </w:pPr>
+      <w:bookmarkStart w:id="4" w:name="_Toc243854535"/>
+      <w:r>
+        <w:t>3 Results</w:t>
+      </w:r>
+      <w:bookmarkEnd w:id="4"/>
+      <w:r>
+        <w:t xml:space="preserve"> </w:t>
+      </w:r>
+    </w:p>
+    <w:p/>
+    <w:p>
+      <w:pPr>
+        <w:pStyle w:val="Heading1"/>
+      </w:pPr>
+      <w:bookmarkStart w:id="5" w:name="_Toc243854536"/>
+      <w:r>
+        <w:t>4 Conclusion</w:t>
+      </w:r>
+      <w:bookmarkEnd w:id="5"/>
+      <w:r>
+        <w:t xml:space="preserve"> </w:t>
+      </w:r>
+    </w:p>
+    <w:p/>
     <w:p/>
     <w:sectPr>
       <w:pgSz w:w="12240" w:h="15840"/>
@@ -420,7 +1212,7 @@
     <w:link w:val="Heading1Char"/>
     <w:uiPriority w:val="9"/>
     <w:qFormat/>
-    <w:rsid w:val="00E47636"/>
+    <w:rsid w:val="006521D3"/>
     <w:pPr>
       <w:keepNext/>
       <w:keepLines/>
@@ -428,8 +1220,7 @@
       <w:outlineLvl w:val="0"/>
     </w:pPr>
     <w:rPr>
-      <w:rFonts w:asciiTheme="majorHAnsi" w:eastAsiaTheme="majorEastAsia" w:hAnsiTheme="majorHAnsi" w:cstheme="majorBidi"/>
-      <w:color w:val="0F4761" w:themeColor="accent1" w:themeShade="BF"/>
+      <w:rFonts w:ascii="Times New Roman" w:eastAsiaTheme="majorEastAsia" w:hAnsi="Times New Roman" w:cstheme="majorBidi"/>
       <w:sz w:val="40"/>
       <w:szCs w:val="40"/>
     </w:rPr>
@@ -644,10 +1435,9 @@
     <w:basedOn w:val="DefaultParagraphFont"/>
     <w:link w:val="Heading1"/>
     <w:uiPriority w:val="9"/>
-    <w:rsid w:val="00E47636"/>
-    <w:rPr>
-      <w:rFonts w:asciiTheme="majorHAnsi" w:eastAsiaTheme="majorEastAsia" w:hAnsiTheme="majorHAnsi" w:cstheme="majorBidi"/>
-      <w:color w:val="0F4761" w:themeColor="accent1" w:themeShade="BF"/>
+    <w:rsid w:val="006521D3"/>
+    <w:rPr>
+      <w:rFonts w:ascii="Times New Roman" w:eastAsiaTheme="majorEastAsia" w:hAnsi="Times New Roman" w:cstheme="majorBidi"/>
       <w:sz w:val="40"/>
       <w:szCs w:val="40"/>
     </w:rPr>
@@ -927,6 +1717,48 @@
       <w:smallCaps/>
       <w:color w:val="0F4761" w:themeColor="accent1" w:themeShade="BF"/>
       <w:spacing w:val="5"/>
+    </w:rPr>
+  </w:style>
+  <w:style w:type="paragraph" w:styleId="TOCHeading">
+    <w:name w:val="TOC Heading"/>
+    <w:basedOn w:val="Heading1"/>
+    <w:next w:val="Normal"/>
+    <w:uiPriority w:val="39"/>
+    <w:unhideWhenUsed/>
+    <w:qFormat/>
+    <w:rsid w:val="00A9584A"/>
+    <w:pPr>
+      <w:spacing w:before="240" w:after="0"/>
+      <w:outlineLvl w:val="9"/>
+    </w:pPr>
+    <w:rPr>
+      <w:sz w:val="32"/>
+      <w:szCs w:val="32"/>
+      <w:lang w:eastAsia="en-GB"/>
+      <w14:ligatures w14:val="none"/>
+    </w:rPr>
+  </w:style>
+  <w:style w:type="paragraph" w:styleId="TOC1">
+    <w:name w:val="toc 1"/>
+    <w:basedOn w:val="Normal"/>
+    <w:next w:val="Normal"/>
+    <w:autoRedefine/>
+    <w:uiPriority w:val="39"/>
+    <w:unhideWhenUsed/>
+    <w:rsid w:val="006521D3"/>
+    <w:pPr>
+      <w:spacing w:after="100"/>
+    </w:pPr>
+  </w:style>
+  <w:style w:type="character" w:styleId="Hyperlink">
+    <w:name w:val="Hyperlink"/>
+    <w:basedOn w:val="DefaultParagraphFont"/>
+    <w:uiPriority w:val="99"/>
+    <w:unhideWhenUsed/>
+    <w:rsid w:val="006521D3"/>
+    <w:rPr>
+      <w:color w:val="467886" w:themeColor="hyperlink"/>
+      <w:u w:val="single"/>
     </w:rPr>
   </w:style>
 </w:styles>
@@ -1245,4 +2077,16 @@
     </a:ext>
   </a:extLst>
 </a:theme>
+</file>
+
+<file path=customXml/item1.xml><?xml version="1.0" encoding="utf-8"?>
+<b:Sources xmlns:b="http://schemas.openxmlformats.org/officeDocument/2006/bibliography" xmlns="http://schemas.openxmlformats.org/officeDocument/2006/bibliography" SelectedStyle="\APASixthEditionOfficeOnline.xsl" StyleName="APA" Version="6"/>
+</file>
+
+<file path=customXml/itemProps1.xml><?xml version="1.0" encoding="utf-8"?>
+<ds:datastoreItem xmlns:ds="http://schemas.openxmlformats.org/officeDocument/2006/customXml" ds:itemID="{D9E505F6-CF5A-4275-8175-823DE57812F5}">
+  <ds:schemaRefs>
+    <ds:schemaRef ds:uri="http://schemas.openxmlformats.org/officeDocument/2006/bibliography"/>
+  </ds:schemaRefs>
+</ds:datastoreItem>
 </file>
</xml_diff>